<commit_message>
Class 4 slides 39-40 corrected.
</commit_message>
<xml_diff>
--- a/class04w.docx
+++ b/class04w.docx
@@ -9233,7 +9233,7 @@
         <w:rPr>
           <w:rStyle w:val="NormalTok"/>
         </w:rPr>
-        <w:t xml:space="preserve"> love_htin)) </w:t>
+        <w:t xml:space="preserve"> height_in)) </w:t>
       </w:r>
       <w:r>
         <w:rPr>
@@ -13619,7 +13619,7 @@
         <w:rPr>
           <w:rStyle w:val="VerbatimChar"/>
         </w:rPr>
-        <w:t xml:space="preserve">  bayestestR_0.18.1   bit_4.6.0           bit64_4.8.4        </w:t>
+        <w:t xml:space="preserve">  bayestestR_0.18.1   bit_4.6.0           bit64_4.8.6        </w:t>
       </w:r>
       <w:r>
         <w:br/>
@@ -13772,7 +13772,7 @@
         <w:rPr>
           <w:rStyle w:val="VerbatimChar"/>
         </w:rPr>
-        <w:t xml:space="preserve">  htmltools_0.5.9     httr_1.4.8          ids_1.0.1          </w:t>
+        <w:t xml:space="preserve">  htmltools_0.5.9     httr_1.4.9          ids_1.0.1          </w:t>
       </w:r>
       <w:r>
         <w:br/>
@@ -13844,7 +13844,7 @@
         <w:rPr>
           <w:rStyle w:val="VerbatimChar"/>
         </w:rPr>
-        <w:t xml:space="preserve">  naniar_1.1.0        nlme_3.1-170        norm_1.0.11.1      </w:t>
+        <w:t xml:space="preserve">  naniar_1.1.0        nlme_3.1-171        norm_1.0.11.1      </w:t>
       </w:r>
       <w:r>
         <w:br/>
@@ -13862,16 +13862,16 @@
         <w:rPr>
           <w:rStyle w:val="VerbatimChar"/>
         </w:rPr>
-        <w:t xml:space="preserve">  parallel_4.6.1      parameters_0.29.2   patchwork_1.3.2    </w:t>
-      </w:r>
-      <w:r>
-        <w:br/>
-      </w:r>
-      <w:r>
-        <w:rPr>
-          <w:rStyle w:val="VerbatimChar"/>
-        </w:rPr>
-        <w:t xml:space="preserve">  performance_0.18.0  pillar_1.11.1       pkgconfig_2.0.3    </w:t>
+        <w:t xml:space="preserve">  parallel_4.6.1      parameters_0.29.3   patchwork_1.3.2    </w:t>
+      </w:r>
+      <w:r>
+        <w:br/>
+      </w:r>
+      <w:r>
+        <w:rPr>
+          <w:rStyle w:val="VerbatimChar"/>
+        </w:rPr>
+        <w:t xml:space="preserve">  performance_0.18.1  pillar_1.11.1       pkgconfig_2.0.3    </w:t>
       </w:r>
       <w:r>
         <w:br/>
@@ -13934,7 +13934,7 @@
         <w:rPr>
           <w:rStyle w:val="VerbatimChar"/>
         </w:rPr>
-        <w:t xml:space="preserve">  rmarkdown_2.31      rstudioapi_0.19.0   rvest_1.0.5        </w:t>
+        <w:t xml:space="preserve">  rmarkdown_2.32      rstudioapi_0.19.0   rvest_1.0.5        </w:t>
       </w:r>
       <w:r>
         <w:br/>
@@ -13952,7 +13952,7 @@
         <w:rPr>
           <w:rStyle w:val="VerbatimChar"/>
         </w:rPr>
-        <w:t xml:space="preserve">  scales_1.4.0        see_0.14.1          selectr_0.6.0      </w:t>
+        <w:t xml:space="preserve">  scales_1.4.0        see_0.14.2          selectr_0.6.0      </w:t>
       </w:r>
       <w:r>
         <w:br/>

</xml_diff>